<commit_message>
Renumber the manuscript section from 4 to 2
Section heading, subsections (2.1-2.4), all nine displayed-equation numbers
(2.1)-(2.9) and every in-text cross-reference are renumbered consistently;
no stray 4.x references remain. The figure keeps its own number (Figure 2),
which is independent of the section numbering. Content unchanged.

Data re-checked: a from-scratch rerun of lambda_c_extrap.py reproduces
figure_data.json bit-identically, and a programmatic diff confirms every
numeral quoted in the document (the eight lambda_c values, the eight
extrapolated values, the relative deviations, the sigma pulls, the 6e-4
maximum and the 1.5-sigma bound) matches that fresh computation, in order.
verify.py and verify_ode.py both ALL PASS.

Co-Authored-By: Claude Opus 5 <noreply@anthropic.com>
Claude-Session: https://claude.ai/code/session_01GMqZS1ZXii3SRe677Qn7Mk
</commit_message>
<xml_diff>
--- a/multiplex-hypergraph-sir/lambda_c_section_cn.docx
+++ b/multiplex-hypergraph-sir/lambda_c_section_cn.docx
@@ -16,7 +16,7 @@
           <w:sz w:val="26"/>
           <w:szCs w:val="26"/>
         </w:rPr>
-        <w:t xml:space="preserve">4. 由亚临界终态测定爆发阈值</w:t>
+        <w:t xml:space="preserve">2. 由亚临界终态测定爆发阈值</w:t>
       </w:r>
     </w:p>
     <w:p>
@@ -33,7 +33,7 @@
           <w:sz w:val="22"/>
           <w:szCs w:val="22"/>
         </w:rPr>
-        <w:t xml:space="preserve">4.1. 模型与次代矩阵</w:t>
+        <w:t xml:space="preserve">2.1. 模型与次代矩阵</w:t>
       </w:r>
     </w:p>
     <w:p>
@@ -413,7 +413,7 @@
           <w:sz w:val="21"/>
           <w:szCs w:val="21"/>
         </w:rPr>
-        <w:t xml:space="preserve">(4.1)</w:t>
+        <w:t xml:space="preserve">(2.1)</w:t>
       </w:r>
     </w:p>
     <w:p>
@@ -623,7 +623,7 @@
           <w:sz w:val="21"/>
           <w:szCs w:val="21"/>
         </w:rPr>
-        <w:t xml:space="preserve">(4.2)</w:t>
+        <w:t xml:space="preserve">(2.2)</w:t>
       </w:r>
     </w:p>
     <w:p>
@@ -925,7 +925,7 @@
           <w:sz w:val="21"/>
           <w:szCs w:val="21"/>
         </w:rPr>
-        <w:t xml:space="preserve">(4.3)</w:t>
+        <w:t xml:space="preserve">(2.3)</w:t>
       </w:r>
     </w:p>
     <w:p>
@@ -1001,7 +1001,7 @@
           <w:sz w:val="21"/>
           <w:szCs w:val="21"/>
         </w:rPr>
-        <w:t xml:space="preserve">暴露独立，群内耦合并未被忽略，而是已由 (4.2) 的计数状态承载。方程组的维数为 </w:t>
+        <w:t xml:space="preserve">暴露独立，群内耦合并未被忽略，而是已由 (2.2) 的计数状态承载。方程组的维数为 </w:t>
       </w:r>
       <w:r>
         <w:rPr>
@@ -1108,7 +1108,7 @@
           <w:sz w:val="21"/>
           <w:szCs w:val="21"/>
         </w:rPr>
-        <w:t xml:space="preserve">(4.4)</w:t>
+        <w:t xml:space="preserve">(2.4)</w:t>
       </w:r>
     </w:p>
     <w:p>
@@ -1298,7 +1298,7 @@
           <w:sz w:val="21"/>
           <w:szCs w:val="21"/>
         </w:rPr>
-        <w:t xml:space="preserve">(4.5)</w:t>
+        <w:t xml:space="preserve">(2.5)</w:t>
       </w:r>
     </w:p>
     <w:p>
@@ -1365,7 +1365,7 @@
           <w:sz w:val="21"/>
           <w:szCs w:val="21"/>
         </w:rPr>
-        <w:t xml:space="preserve">(4.6)</w:t>
+        <w:t xml:space="preserve">(2.6)</w:t>
       </w:r>
     </w:p>
     <w:p>
@@ -1871,7 +1871,7 @@
           <w:sz w:val="21"/>
           <w:szCs w:val="21"/>
         </w:rPr>
-        <w:t xml:space="preserve">(4.7)</w:t>
+        <w:t xml:space="preserve">(2.7)</w:t>
       </w:r>
     </w:p>
     <w:p>
@@ -1960,7 +1960,7 @@
           <w:sz w:val="21"/>
           <w:szCs w:val="21"/>
         </w:rPr>
-        <w:t xml:space="preserve">，(4.7) 回到多层网络 SIR 的已知阈值；</w:t>
+        <w:t xml:space="preserve">，(2.7) 回到多层网络 SIR 的已知阈值；</w:t>
       </w:r>
       <w:r>
         <w:rPr>
@@ -2107,7 +2107,7 @@
           <w:sz w:val="22"/>
           <w:szCs w:val="22"/>
         </w:rPr>
-        <w:t xml:space="preserve">4.2. 亚临界簇规模与外推判据</w:t>
+        <w:t xml:space="preserve">2.2. 亚临界簇规模与外推判据</w:t>
       </w:r>
     </w:p>
     <w:p>
@@ -2123,7 +2123,7 @@
           <w:sz w:val="21"/>
           <w:szCs w:val="21"/>
         </w:rPr>
-        <w:t xml:space="preserve">(4.7) 给出的阈值是线性化的产物。本小节给出一条不经由线性化的独立判据，其思路与谱方法正相反：始终停在阈值以下，由小种子所引发簇的规模发散读出 </w:t>
+        <w:t xml:space="preserve">(2.7) 给出的阈值是线性化的产物。本小节给出一条不经由线性化的独立判据，其思路与谱方法正相反：始终停在阈值以下，由小种子所引发簇的规模发散读出 </w:t>
       </w:r>
       <w:r>
         <w:rPr>
@@ -2270,7 +2270,7 @@
           <w:sz w:val="21"/>
           <w:szCs w:val="21"/>
         </w:rPr>
-        <w:t xml:space="preserve">(4.8)</w:t>
+        <w:t xml:space="preserve">(2.8)</w:t>
       </w:r>
     </w:p>
     <w:p>
@@ -2426,7 +2426,7 @@
           <w:sz w:val="21"/>
           <w:szCs w:val="21"/>
         </w:rPr>
-        <w:t xml:space="preserve"> 对各型的权重并不相同。可用的性质是 (4.8) 的极点来自 </w:t>
+        <w:t xml:space="preserve"> 对各型的权重并不相同。可用的性质是 (2.8) 的极点来自 </w:t>
       </w:r>
       <w:r>
         <w:rPr>
@@ -2572,7 +2572,7 @@
           <w:sz w:val="21"/>
           <w:szCs w:val="21"/>
         </w:rPr>
-        <w:t xml:space="preserve">(4.9)</w:t>
+        <w:t xml:space="preserve">(2.9)</w:t>
       </w:r>
     </w:p>
     <w:p>
@@ -2634,7 +2634,7 @@
           <w:sz w:val="21"/>
           <w:szCs w:val="21"/>
         </w:rPr>
-        <w:t xml:space="preserve"> 不共享任何中间量：一侧把非线性方程组 (4.2)–(4.4) 积分至终态、再对 (4.9) 作线性拟合，另一侧对次代矩阵 (4.7) 求谱半径并二分，二者仅共享模型定义。两条路线的一致因而是对彼此的非平凡检验，这正是图 2 所报告者。</w:t>
+        <w:t xml:space="preserve"> 不共享任何中间量：一侧把非线性方程组 (2.2)–(2.4) 积分至终态、再对 (2.9) 作线性拟合，另一侧对次代矩阵 (2.7) 求谱半径并二分，二者仅共享模型定义。两条路线的一致因而是对彼此的非平凡检验，这正是图 2 所报告者。</w:t>
       </w:r>
     </w:p>
     <w:p>
@@ -2670,7 +2670,7 @@
           <w:sz w:val="21"/>
           <w:szCs w:val="21"/>
         </w:rPr>
-        <w:t xml:space="preserve">4.9</w:t>
+        <w:t xml:space="preserve">2.9</w:t>
       </w:r>
       <w:r>
         <w:rPr>
@@ -2868,7 +2868,7 @@
           <w:sz w:val="22"/>
           <w:szCs w:val="22"/>
         </w:rPr>
-        <w:t xml:space="preserve">4.3. 数值结果</w:t>
+        <w:t xml:space="preserve">2.3. 数值结果</w:t>
       </w:r>
     </w:p>
     <w:p>
@@ -3047,7 +3047,7 @@
           <w:sz w:val="21"/>
           <w:szCs w:val="21"/>
         </w:rPr>
-        <w:t xml:space="preserve">残余偏差为线性律 (4.9) 的</w:t>
+        <w:t xml:space="preserve">残余偏差为线性律 (2.9) 的</w:t>
       </w:r>
       <w:r>
         <w:rPr>
@@ -3574,7 +3574,7 @@
           <w:sz w:val="22"/>
           <w:szCs w:val="22"/>
         </w:rPr>
-        <w:t xml:space="preserve">4.4. 数值校验</w:t>
+        <w:t xml:space="preserve">2.4. 数值校验</w:t>
       </w:r>
     </w:p>
     <w:p>
@@ -3617,7 +3617,7 @@
           <w:sz w:val="21"/>
           <w:szCs w:val="21"/>
         </w:rPr>
-        <w:t xml:space="preserve">对 (4.2) 的方程组求和，外部风险项、群内项与康复项各自守恒相消，只余 </w:t>
+        <w:t xml:space="preserve">对 (2.2) 的方程组求和，外部风险项、群内项与康复项各自守恒相消，只余 </w:t>
       </w:r>
       <w:r>
         <w:rPr>
@@ -3825,7 +3825,7 @@
           <w:sz w:val="21"/>
           <w:szCs w:val="21"/>
         </w:rPr>
-        <w:t xml:space="preserve"> 量级，纯属积分误差。此外，把 (4.2) 在无病定态作数值 Jacobian，其谱横标在 </w:t>
+        <w:t xml:space="preserve"> 量级，纯属积分误差。此外，把 (2.2) 在无病定态作数值 Jacobian，其谱横标在 </w:t>
       </w:r>
       <w:r>
         <w:rPr>
@@ -3871,7 +3871,7 @@
           <w:sz w:val="21"/>
           <w:szCs w:val="21"/>
         </w:rPr>
-        <w:t xml:space="preserve"> 处为零，达机器精度：闭合与次代矩阵共享同一个阈值，(4.9) 的外推所测者因而确为 (4.7) 的阈值。</w:t>
+        <w:t xml:space="preserve"> 处为零，达机器精度：闭合与次代矩阵共享同一个阈值，(2.9) 的外推所测者因而确为 (2.7) 的阈值。</w:t>
       </w:r>
     </w:p>
     <w:p>
@@ -3898,7 +3898,7 @@
           <w:sz w:val="21"/>
           <w:szCs w:val="21"/>
         </w:rPr>
-        <w:t xml:space="preserve">级联递推 (4.5)–(4.6) 在 </w:t>
+        <w:t xml:space="preserve">级联递推 (2.5)–(2.6) 在 </w:t>
       </w:r>
       <w:r>
         <w:rPr>
@@ -3998,7 +3998,7 @@
           <w:sz w:val="21"/>
           <w:szCs w:val="21"/>
         </w:rPr>
-        <w:t xml:space="preserve"> 时恒为零。阈值公式 (4.7) 在成对退化的 5-正则单层上给出 </w:t>
+        <w:t xml:space="preserve"> 时恒为零。阈值公式 (2.7) 在成对退化的 5-正则单层上给出 </w:t>
       </w:r>
       <w:r>
         <w:rPr>
@@ -4226,7 +4226,7 @@
           <w:sz w:val="21"/>
           <w:szCs w:val="21"/>
         </w:rPr>
-        <w:t xml:space="preserve">闭合的亚临界终态与 (4.8) 的解析值不共享代码——一侧积分非线性方程组，另一侧求一个矩阵逆。以均匀播种写出 </w:t>
+        <w:t xml:space="preserve">闭合的亚临界终态与 (2.8) 的解析值不共享代码——一侧积分非线性方程组，另一侧求一个矩阵逆。以均匀播种写出 </w:t>
       </w:r>
       <w:r>
         <w:rPr>
@@ -4712,7 +4712,7 @@
           <w:sz w:val="21"/>
           <w:szCs w:val="21"/>
         </w:rPr>
-        <w:t xml:space="preserve"> 极限下即为 (4.8)，其极点严格位于 </w:t>
+        <w:t xml:space="preserve"> 极限下即为 (2.8)，其极点严格位于 </w:t>
       </w:r>
       <w:r>
         <w:rPr>
@@ -4860,7 +4860,7 @@
           <w:sz w:val="21"/>
           <w:szCs w:val="21"/>
         </w:rPr>
-        <w:t xml:space="preserve">级联递推 (4.5) 由单群体的直接 Gillespie 抽样独立复核，该检验既不使用方程组也不使用次代矩阵。在 </w:t>
+        <w:t xml:space="preserve">级联递推 (2.5) 由单群体的直接 Gillespie 抽样独立复核，该检验既不使用方程组也不使用次代矩阵。在 </w:t>
       </w:r>
       <w:r>
         <w:rPr>

</xml_diff>

<commit_message>
Renumber the λc figure to Figure 3 (global figure order)
With the mean-field section gone, the paper is Part 1 (message-passing
closure) + Part 2 (λc). Part 1 owns Figure 1 (mechanism schematic) and
Figure 2 (time evolution), so Part 2's λc figure becomes Figure 3.

- lambda_c_section_cn.docx: caption and the in-text reference "图 2 所报告者"
  now read 图 3; no 图 2 remains. Part 2 carries no mean field (it never did).
- Renamed figure2_lambda_c.{png,pdf} -> figure3_lambda_c.{png,pdf}; updated
  figure_lambda_c.py (savefig + docstring), make_doc_cn3.js, and README.

Global figure order is now 图 1 mechanism / 图 2 evolution / 图 3 λc.
verify.py / verify_ode.py pass.
</commit_message>
<xml_diff>
--- a/multiplex-hypergraph-sir/lambda_c_section_cn.docx
+++ b/multiplex-hypergraph-sir/lambda_c_section_cn.docx
@@ -2727,7 +2727,7 @@
           <w:sz w:val="21"/>
           <w:szCs w:val="21"/>
         </w:rPr>
-        <w:t xml:space="preserve"> 不共享任何中间量：一侧把非线性方程组 (2.2)–(2.4) 积分至终态、再对 (2.9) 作线性拟合，另一侧对次代矩阵 (2.7) 求谱半径并二分，二者仅共享模型定义。两条路线的一致因而是对彼此的非平凡检验，这正是图 2 所报告者。</w:t>
+        <w:t xml:space="preserve"> 不共享任何中间量：一侧把非线性方程组 (2.2)–(2.4) 积分至终态、再对 (2.9) 作线性拟合，另一侧对次代矩阵 (2.7) 求谱半径并二分，二者仅共享模型定义。两条路线的一致因而是对彼此的非平凡检验，这正是图 3 所报告者。</w:t>
       </w:r>
     </w:p>
     <w:p>
@@ -3327,7 +3327,7 @@
           <w:sz w:val="18"/>
           <w:szCs w:val="18"/>
         </w:rPr>
-        <w:t xml:space="preserve">图 2</w:t>
+        <w:t xml:space="preserve">图 3</w:t>
       </w:r>
       <w:r>
         <w:rPr>

</xml_diff>

<commit_message>
rebuild docx outputs after de-AI rewrite
Co-Authored-By: Claude Opus 4.6 <noreply@anthropic.com>
Claude-Session: https://claude.ai/code/session_01GMqZS1ZXii3SRe677Qn7Mk
</commit_message>
<xml_diff>
--- a/multiplex-hypergraph-sir/lambda_c_section_cn.docx
+++ b/multiplex-hypergraph-sir/lambda_c_section_cn.docx
@@ -4307,7 +4307,7 @@
           <w:sz w:val="21"/>
           <w:szCs w:val="21"/>
         </w:rPr>
-        <w:t xml:space="preserve"> 上复现该曲线（图 3(b) 箱线），偏离最大 1.9σ、相对差不超过 1.1%。更值得强调的是其机制：相同节点在两层同时充当枢纽，会在边缘结构不变时集中跨层传播能力、压低阈值；反相关则抬高阈值——这一移动在图 3 的相图中表现为临界曲线整体内移（图 3(c)、(d)）。</w:t>
+        <w:t xml:space="preserve"> 上复现该曲线（图 3(b) 箱线），偏离最大 1.9σ、相对差不超过 1.1%。机制明确：相同节点在两层同时充当枢纽，会在边缘结构不变时集中跨层传播能力、压低阈值；反相关则抬高阈值——这一移动在图 3 的相图中表现为临界曲线整体内移（图 3(c)、(d)）。</w:t>
       </w:r>
     </w:p>
     <w:p>
@@ -5882,7 +5882,7 @@
           <w:sz w:val="21"/>
           <w:szCs w:val="21"/>
         </w:rPr>
-        <w:t xml:space="preserve">、偏离最大 1.51σ。这是对爆发阈值的一次全非线性独立确认，与前述 Jacobian 复核互补——后者检验线性化谱，前者检验非线性终态所继承的同一阈值。</w:t>
+        <w:t xml:space="preserve">、偏离最大 1.51σ，构成对爆发阈值的全非线性独立确认——与 Jacobian 复核互补：后者检验线性化谱，前者检验非线性终态所继承的同一阈值。</w:t>
       </w:r>
     </w:p>
     <w:sectPr>

</xml_diff>